<commit_message>
i add the most recent course
</commit_message>
<xml_diff>
--- a/W01/Week1/W01 Writing Project-One Story, Two Audiences.docx
+++ b/W01/Week1/W01 Writing Project-One Story, Two Audiences.docx
@@ -5,6 +5,10 @@
     <w:p>
       <w:pPr>
         <w:pStyle w:val="Heading2"/>
+        <w:numPr>
+          <w:ilvl w:val="1"/>
+          <w:numId w:val="1"/>
+        </w:numPr>
         <w:bidi w:val="0"/>
         <w:spacing w:before="200" w:after="120"/>
         <w:ind w:hanging="0" w:start="0"/>
@@ -79,6 +83,10 @@
     <w:p>
       <w:pPr>
         <w:pStyle w:val="Heading2"/>
+        <w:numPr>
+          <w:ilvl w:val="1"/>
+          <w:numId w:val="1"/>
+        </w:numPr>
         <w:bidi w:val="0"/>
         <w:ind w:hanging="0" w:start="0"/>
         <w:jc w:val="start"/>
@@ -151,6 +159,10 @@
     <w:p>
       <w:pPr>
         <w:pStyle w:val="Heading2"/>
+        <w:numPr>
+          <w:ilvl w:val="1"/>
+          <w:numId w:val="1"/>
+        </w:numPr>
         <w:bidi w:val="0"/>
         <w:ind w:hanging="0" w:start="0"/>
         <w:jc w:val="start"/>
@@ -205,6 +217,7 @@
       <w:pgNumType w:fmt="decimal"/>
       <w:formProt w:val="false"/>
       <w:textDirection w:val="lrTb"/>
+      <w:docGrid w:type="default" w:linePitch="100" w:charSpace="0"/>
     </w:sectPr>
   </w:body>
 </w:document>
@@ -216,21 +229,147 @@
     <w:lvl w:ilvl="0">
       <w:start w:val="1"/>
       <w:numFmt w:val="none"/>
-      <w:pStyle w:val="Heading1"/>
-      <w:suff w:val="nothing"/>
-      <w:lvlText w:val=""/>
-      <w:lvlJc w:val="start"/>
-      <w:pPr>
-        <w:tabs>
-          <w:tab w:val="num" w:pos="0"/>
-        </w:tabs>
-        <w:ind w:start="0" w:hanging="0"/>
-      </w:pPr>
+      <w:suff w:val="nothing"/>
+      <w:lvlText w:val=""/>
+      <w:lvlJc w:val="start"/>
+      <w:pPr>
+        <w:tabs>
+          <w:tab w:val="num" w:pos="0"/>
+        </w:tabs>
+        <w:ind w:start="0" w:hanging="0"/>
+      </w:pPr>
+      <w:rPr/>
     </w:lvl>
     <w:lvl w:ilvl="1">
       <w:start w:val="1"/>
       <w:numFmt w:val="none"/>
-      <w:pStyle w:val="Heading2"/>
+      <w:suff w:val="nothing"/>
+      <w:lvlText w:val=""/>
+      <w:lvlJc w:val="start"/>
+      <w:pPr>
+        <w:tabs>
+          <w:tab w:val="num" w:pos="0"/>
+        </w:tabs>
+        <w:ind w:start="0" w:hanging="0"/>
+      </w:pPr>
+      <w:rPr/>
+    </w:lvl>
+    <w:lvl w:ilvl="2">
+      <w:start w:val="1"/>
+      <w:numFmt w:val="none"/>
+      <w:suff w:val="nothing"/>
+      <w:lvlText w:val=""/>
+      <w:lvlJc w:val="start"/>
+      <w:pPr>
+        <w:tabs>
+          <w:tab w:val="num" w:pos="0"/>
+        </w:tabs>
+        <w:ind w:start="0" w:hanging="0"/>
+      </w:pPr>
+      <w:rPr/>
+    </w:lvl>
+    <w:lvl w:ilvl="3">
+      <w:start w:val="1"/>
+      <w:numFmt w:val="none"/>
+      <w:suff w:val="nothing"/>
+      <w:lvlText w:val=""/>
+      <w:lvlJc w:val="start"/>
+      <w:pPr>
+        <w:tabs>
+          <w:tab w:val="num" w:pos="0"/>
+        </w:tabs>
+        <w:ind w:start="0" w:hanging="0"/>
+      </w:pPr>
+      <w:rPr/>
+    </w:lvl>
+    <w:lvl w:ilvl="4">
+      <w:start w:val="1"/>
+      <w:numFmt w:val="none"/>
+      <w:suff w:val="nothing"/>
+      <w:lvlText w:val=""/>
+      <w:lvlJc w:val="start"/>
+      <w:pPr>
+        <w:tabs>
+          <w:tab w:val="num" w:pos="0"/>
+        </w:tabs>
+        <w:ind w:start="0" w:hanging="0"/>
+      </w:pPr>
+      <w:rPr/>
+    </w:lvl>
+    <w:lvl w:ilvl="5">
+      <w:start w:val="1"/>
+      <w:numFmt w:val="none"/>
+      <w:suff w:val="nothing"/>
+      <w:lvlText w:val=""/>
+      <w:lvlJc w:val="start"/>
+      <w:pPr>
+        <w:tabs>
+          <w:tab w:val="num" w:pos="0"/>
+        </w:tabs>
+        <w:ind w:start="0" w:hanging="0"/>
+      </w:pPr>
+      <w:rPr/>
+    </w:lvl>
+    <w:lvl w:ilvl="6">
+      <w:start w:val="1"/>
+      <w:numFmt w:val="none"/>
+      <w:suff w:val="nothing"/>
+      <w:lvlText w:val=""/>
+      <w:lvlJc w:val="start"/>
+      <w:pPr>
+        <w:tabs>
+          <w:tab w:val="num" w:pos="0"/>
+        </w:tabs>
+        <w:ind w:start="0" w:hanging="0"/>
+      </w:pPr>
+      <w:rPr/>
+    </w:lvl>
+    <w:lvl w:ilvl="7">
+      <w:start w:val="1"/>
+      <w:numFmt w:val="none"/>
+      <w:suff w:val="nothing"/>
+      <w:lvlText w:val=""/>
+      <w:lvlJc w:val="start"/>
+      <w:pPr>
+        <w:tabs>
+          <w:tab w:val="num" w:pos="0"/>
+        </w:tabs>
+        <w:ind w:start="0" w:hanging="0"/>
+      </w:pPr>
+      <w:rPr/>
+    </w:lvl>
+    <w:lvl w:ilvl="8">
+      <w:start w:val="1"/>
+      <w:numFmt w:val="none"/>
+      <w:suff w:val="nothing"/>
+      <w:lvlText w:val=""/>
+      <w:lvlJc w:val="start"/>
+      <w:pPr>
+        <w:tabs>
+          <w:tab w:val="num" w:pos="0"/>
+        </w:tabs>
+        <w:ind w:start="0" w:hanging="0"/>
+      </w:pPr>
+      <w:rPr/>
+    </w:lvl>
+  </w:abstractNum>
+  <w:abstractNum w:abstractNumId="2">
+    <w:lvl w:ilvl="0">
+      <w:start w:val="1"/>
+      <w:numFmt w:val="none"/>
+      <w:suff w:val="nothing"/>
+      <w:lvlText w:val=""/>
+      <w:lvlJc w:val="start"/>
+      <w:pPr>
+        <w:tabs>
+          <w:tab w:val="num" w:pos="0"/>
+        </w:tabs>
+        <w:ind w:start="0" w:hanging="0"/>
+      </w:pPr>
+    </w:lvl>
+    <w:lvl w:ilvl="1">
+      <w:start w:val="1"/>
+      <w:numFmt w:val="none"/>
       <w:suff w:val="nothing"/>
       <w:lvlText w:val=""/>
       <w:lvlJc w:val="start"/>
@@ -335,6 +474,9 @@
   </w:abstractNum>
   <w:num w:numId="1">
     <w:abstractNumId w:val="1"/>
+  </w:num>
+  <w:num w:numId="2">
+    <w:abstractNumId w:val="2"/>
   </w:num>
 </w:numbering>
 </file>
@@ -353,7 +495,6 @@
     </w:rPrDefault>
     <w:pPrDefault>
       <w:pPr>
-        <w:widowControl/>
         <w:suppressAutoHyphens w:val="true"/>
       </w:pPr>
     </w:pPrDefault>
@@ -363,7 +504,10 @@
     <w:qFormat/>
     <w:pPr>
       <w:widowControl/>
+      <w:suppressAutoHyphens w:val="true"/>
       <w:bidi w:val="0"/>
+      <w:spacing w:before="0" w:after="0"/>
+      <w:jc w:val="start"/>
     </w:pPr>
     <w:rPr>
       <w:rFonts w:ascii="Liberation Serif" w:hAnsi="Liberation Serif" w:eastAsia="Noto Serif CJK SC" w:cs="FreeSans"/>

</xml_diff>